<commit_message>
Edited files to note suh deprecation
Clean-up to keep everything consistent.
</commit_message>
<xml_diff>
--- a/Smallest_Classification_Instructions_FHTW2025_read-print-able.docx
+++ b/Smallest_Classification_Instructions_FHTW2025_read-print-able.docx
@@ -2678,11 +2678,9 @@
             <w:vAlign w:val="center"/>
           </w:tcPr>
           <w:p>
-            <w:proofErr w:type="spellStart"/>
             <w:r>
               <w:t>General_Not_In_Situ_Reuse</w:t>
             </w:r>
-            <w:proofErr w:type="spellEnd"/>
           </w:p>
         </w:tc>
         <w:tc>
@@ -3960,6 +3958,15 @@
           </w:tcPr>
           <w:p>
             <w:r>
+              <w:rPr>
+                <w:vertAlign w:val="superscript"/>
+              </w:rPr>
+              <w:t>†</w:t>
+            </w:r>
+            <w:r>
+              <w:rPr>
+                <w:strike/>
+              </w:rPr>
               <w:t>c113</w:t>
             </w:r>
           </w:p>
@@ -3977,27 +3984,44 @@
             <w:vAlign w:val="center"/>
           </w:tcPr>
           <w:p>
+            <w:r>
+              <w:rPr>
+                <w:vertAlign w:val="superscript"/>
+              </w:rPr>
+              <w:t>†</w:t>
+            </w:r>
             <w:proofErr w:type="spellStart"/>
             <w:r>
+              <w:rPr>
+                <w:strike/>
+              </w:rPr>
               <w:t>Somewhat_Uneasy_with_Classification_or_Hard</w:t>
             </w:r>
             <w:proofErr w:type="spellEnd"/>
             <w:r>
+              <w:rPr>
+                <w:strike/>
+              </w:rPr>
               <w:br/>
               <w:t>[Initially</w:t>
             </w:r>
             <w:r>
               <w:rPr>
+                <w:strike/>
                 <w:sz w:val="18"/>
                 <w:szCs w:val="18"/>
               </w:rPr>
               <w:t xml:space="preserve"> </w:t>
             </w:r>
             <w:r>
+              <w:rPr>
+                <w:strike/>
+              </w:rPr>
               <w:t>considered</w:t>
             </w:r>
             <w:r>
               <w:rPr>
+                <w:strike/>
                 <w:sz w:val="18"/>
                 <w:szCs w:val="18"/>
               </w:rPr>
@@ -4005,20 +4029,30 @@
             </w:r>
             <w:proofErr w:type="spellStart"/>
             <w:r>
+              <w:rPr>
+                <w:strike/>
+              </w:rPr>
               <w:t>Uneasy_with_Positive</w:t>
             </w:r>
             <w:proofErr w:type="spellEnd"/>
             <w:r>
+              <w:rPr>
+                <w:strike/>
+              </w:rPr>
               <w:t xml:space="preserve"> but decided wider class (</w:t>
             </w:r>
             <w:r>
               <w:rPr>
                 <w:i/>
                 <w:iCs/>
+                <w:strike/>
               </w:rPr>
               <w:t>possibly</w:t>
             </w:r>
             <w:r>
+              <w:rPr>
+                <w:strike/>
+              </w:rPr>
               <w:t xml:space="preserve"> including negatives) with those I find or that I think the algorithm will find hard]</w:t>
             </w:r>
           </w:p>
@@ -4043,7 +4077,14 @@
             </w:pPr>
             <w:r>
               <w:rPr>
+                <w:vertAlign w:val="superscript"/>
+              </w:rPr>
+              <w:t>†</w:t>
+            </w:r>
+            <w:r>
+              <w:rPr>
                 <w:rFonts w:ascii="Courier New" w:hAnsi="Courier New" w:cs="Courier New"/>
+                <w:strike/>
               </w:rPr>
               <w:t>H</w:t>
             </w:r>
@@ -4062,11 +4103,22 @@
             <w:vAlign w:val="center"/>
           </w:tcPr>
           <w:p>
+            <w:r>
+              <w:rPr>
+                <w:vertAlign w:val="superscript"/>
+              </w:rPr>
+              <w:t>†</w:t>
+            </w:r>
             <w:proofErr w:type="spellStart"/>
-            <w:r>
+            <w:proofErr w:type="gramStart"/>
+            <w:r>
+              <w:rPr>
+                <w:strike/>
+              </w:rPr>
               <w:t>suh</w:t>
             </w:r>
             <w:proofErr w:type="spellEnd"/>
+            <w:proofErr w:type="gramEnd"/>
           </w:p>
         </w:tc>
         <w:tc>
@@ -4084,29 +4136,42 @@
           <w:p>
             <w:r>
               <w:rPr>
+                <w:vertAlign w:val="superscript"/>
+              </w:rPr>
+              <w:t>†</w:t>
+            </w:r>
+            <w:proofErr w:type="gramStart"/>
+            <w:r>
+              <w:rPr>
+                <w:strike/>
                 <w:u w:val="single"/>
               </w:rPr>
               <w:t>s</w:t>
             </w:r>
             <w:r>
-              <w:t xml:space="preserve">omewhat </w:t>
-            </w:r>
-            <w:r>
               <w:rPr>
                 <w:strike/>
               </w:rPr>
-              <w:t>u</w:t>
-            </w:r>
-            <w:r>
-              <w:t xml:space="preserve">neasy </w:t>
-            </w:r>
-            <w:r>
-              <w:rPr>
+              <w:t>omewhat</w:t>
+            </w:r>
+            <w:proofErr w:type="gramEnd"/>
+            <w:r>
+              <w:rPr>
+                <w:strike/>
+              </w:rPr>
+              <w:t xml:space="preserve"> uneasy </w:t>
+            </w:r>
+            <w:r>
+              <w:rPr>
+                <w:strike/>
                 <w:u w:val="single"/>
               </w:rPr>
               <w:t>h</w:t>
             </w:r>
             <w:r>
+              <w:rPr>
+                <w:strike/>
+              </w:rPr>
               <w:t>ard</w:t>
             </w:r>
           </w:p>
@@ -4123,7 +4188,14 @@
             </w:tcMar>
             <w:vAlign w:val="center"/>
           </w:tcPr>
-          <w:p/>
+          <w:p>
+            <w:r>
+              <w:rPr>
+                <w:vertAlign w:val="superscript"/>
+              </w:rPr>
+              <w:t>†</w:t>
+            </w:r>
+          </w:p>
         </w:tc>
       </w:tr>
       <w:tr>
@@ -4286,11 +4358,9 @@
             <w:hideMark/>
           </w:tcPr>
           <w:p>
-            <w:proofErr w:type="spellStart"/>
             <w:r>
               <w:t>No_For_Binding_Reuse</w:t>
             </w:r>
-            <w:proofErr w:type="spellEnd"/>
           </w:p>
         </w:tc>
         <w:tc>
@@ -5202,7 +5272,14 @@
     <w:p/>
     <w:p>
       <w:r>
-        <w:t xml:space="preserve">Notes: Contains only the classes used for the fragments-in-bindings study for the Family History Technology Workshop in 2025. At the moment, I'm leaving the 'one </w:t>
+        <w:rPr>
+          <w:b/>
+          <w:bCs/>
+        </w:rPr>
+        <w:t>Notes:</w:t>
+      </w:r>
+      <w:r>
+        <w:t xml:space="preserve"> Contains only the classes used for the fragments-in-bindings study for the Family History Technology Workshop in 2025. At the moment, I'm leaving the 'one </w:t>
       </w:r>
       <w:proofErr w:type="spellStart"/>
       <w:r>
@@ -5226,6 +5303,129 @@
     </w:p>
     <w:p>
       <w:r>
+        <w:rPr>
+          <w:b/>
+          <w:bCs/>
+        </w:rPr>
+        <w:lastRenderedPageBreak/>
+        <w:t xml:space="preserve">More Notes, </w:t>
+      </w:r>
+      <w:proofErr w:type="gramStart"/>
+      <w:r>
+        <w:rPr>
+          <w:b/>
+          <w:bCs/>
+        </w:rPr>
+        <w:t>Edit</w:t>
+      </w:r>
+      <w:proofErr w:type="gramEnd"/>
+      <w:r>
+        <w:rPr>
+          <w:b/>
+          <w:bCs/>
+        </w:rPr>
+        <w:t xml:space="preserve"> (2026-10-13)</w:t>
+      </w:r>
+      <w:r>
+        <w:t xml:space="preserve">: </w:t>
+      </w:r>
+      <w:r>
+        <w:t xml:space="preserve">The continuing studies after the inability to go to FHTW 2025 are using the same procedures as noted here, especially as work is done towards a submission to the 2026 </w:t>
+      </w:r>
+      <w:hyperlink r:id="rId4" w:history="1">
+        <w:r>
+          <w:rPr>
+            <w:rStyle w:val="Hyperlink"/>
+            <w:i/>
+            <w:iCs/>
+          </w:rPr>
+          <w:t>Fragmentology</w:t>
+        </w:r>
+      </w:hyperlink>
+      <w:r>
+        <w:t>.</w:t>
+      </w:r>
+      <w:r>
+        <w:br/>
+      </w:r>
+      <w:r>
+        <w:rPr>
+          <w:b/>
+          <w:bCs/>
+        </w:rPr>
+        <w:t>†</w:t>
+      </w:r>
+      <w:r>
+        <w:t xml:space="preserve"> Deprecated classification: </w:t>
+      </w:r>
+      <w:proofErr w:type="spellStart"/>
+      <w:r>
+        <w:rPr>
+          <w:rFonts w:ascii="Courier New" w:hAnsi="Courier New" w:cs="Courier New"/>
+        </w:rPr>
+        <w:t>suh</w:t>
+      </w:r>
+      <w:proofErr w:type="spellEnd"/>
+      <w:r>
+        <w:t xml:space="preserve"> (</w:t>
+      </w:r>
+      <w:r>
+        <w:rPr>
+          <w:rFonts w:ascii="Courier New" w:hAnsi="Courier New" w:cs="Courier New"/>
+        </w:rPr>
+        <w:t>c113</w:t>
+      </w:r>
+      <w:r>
+        <w:t xml:space="preserve">, </w:t>
+      </w:r>
+      <w:proofErr w:type="spellStart"/>
+      <w:r>
+        <w:rPr>
+          <w:i/>
+          <w:iCs/>
+        </w:rPr>
+        <w:t>Somewhat_Uneasy_with_Classification_or_Hard</w:t>
+      </w:r>
+      <w:proofErr w:type="spellEnd"/>
+      <w:r>
+        <w:t xml:space="preserve">) is not part of the current RMMFB/Fragmentology-2026 (previously RMFB/FHTW2025) classification scheme. It had been omitted from the active FHTW2025 classification helper by 2025-03-01. Some historical filenames in the frozen 3,331-image corpus retain the </w:t>
+      </w:r>
+      <w:r>
+        <w:rPr>
+          <w:rFonts w:ascii="Courier New" w:hAnsi="Courier New" w:cs="Courier New"/>
+        </w:rPr>
+        <w:t>_</w:t>
+      </w:r>
+      <w:proofErr w:type="spellStart"/>
+      <w:r>
+        <w:rPr>
+          <w:rFonts w:ascii="Courier New" w:hAnsi="Courier New" w:cs="Courier New"/>
+        </w:rPr>
+        <w:t>suh</w:t>
+      </w:r>
+      <w:proofErr w:type="spellEnd"/>
+      <w:r>
+        <w:t xml:space="preserve"> token; these filenames are preserved for provenance, and </w:t>
+      </w:r>
+      <w:proofErr w:type="spellStart"/>
+      <w:r>
+        <w:rPr>
+          <w:rFonts w:ascii="Courier New" w:hAnsi="Courier New" w:cs="Courier New"/>
+        </w:rPr>
+        <w:t>suh</w:t>
+      </w:r>
+      <w:proofErr w:type="spellEnd"/>
+      <w:r>
+        <w:t xml:space="preserve"> is ignored when deriving current labels. (Continuation of 2026-10-13 Notes)</w:t>
+      </w:r>
+    </w:p>
+    <w:p>
+      <w:r>
+        <w:br w:type="page"/>
+      </w:r>
+    </w:p>
+    <w:p>
+      <w:r>
         <w:lastRenderedPageBreak/>
         <w:t>Other classes to be used later in Manuscript Studies things</w:t>
       </w:r>
@@ -5599,8 +5799,13 @@
     </w:p>
     <w:p>
       <w:r>
-        <w:t>c55 / Non_Manicule_Nota_Bene</w:t>
-      </w:r>
+        <w:t xml:space="preserve">c55 / </w:t>
+      </w:r>
+      <w:proofErr w:type="spellStart"/>
+      <w:r>
+        <w:t>Non_Manicule_Nota_Bene</w:t>
+      </w:r>
+      <w:proofErr w:type="spellEnd"/>
       <w:r>
         <w:tab/>
       </w:r>
@@ -7349,6 +7554,29 @@
       <w:spacing w:val="5"/>
     </w:rPr>
   </w:style>
+  <w:style w:type="character" w:styleId="Hyperlink">
+    <w:name w:val="Hyperlink"/>
+    <w:basedOn w:val="DefaultParagraphFont"/>
+    <w:uiPriority w:val="99"/>
+    <w:unhideWhenUsed/>
+    <w:rsid w:val="00241140"/>
+    <w:rPr>
+      <w:color w:val="0563C1" w:themeColor="hyperlink"/>
+      <w:u w:val="single"/>
+    </w:rPr>
+  </w:style>
+  <w:style w:type="character" w:styleId="UnresolvedMention">
+    <w:name w:val="Unresolved Mention"/>
+    <w:basedOn w:val="DefaultParagraphFont"/>
+    <w:uiPriority w:val="99"/>
+    <w:semiHidden/>
+    <w:unhideWhenUsed/>
+    <w:rsid w:val="00241140"/>
+    <w:rPr>
+      <w:color w:val="605E5C"/>
+      <w:shd w:val="clear" w:color="auto" w:fill="E1DFDD"/>
+    </w:rPr>
+  </w:style>
 </w:styles>
 </file>
 

</xml_diff>